<commit_message>
feat: finalize presentation decks, reports, web application, and clean up workspace
</commit_message>
<xml_diff>
--- a/FraudLens_Review_1.docx
+++ b/FraudLens_Review_1.docx
@@ -132,6 +132,37 @@
                 <w:sz w:val="18"/>
               </w:rPr>
               <w:t>D Joshua Daniel (24BCE0436)  ·  M Saryu (24BCE2524)</w:t>
+            </w:r>
+          </w:p>
+        </w:tc>
+      </w:tr>
+      <w:tr>
+        <w:tc>
+          <w:tcPr>
+            <w:tcW w:type="dxa" w:w="4968"/>
+            <w:shd w:fill="F8FAFC"/>
+          </w:tcPr>
+          <w:p>
+            <w:r>
+              <w:rPr>
+                <w:b/>
+                <w:sz w:val="18"/>
+              </w:rPr>
+              <w:t>Faculty Guide:</w:t>
+            </w:r>
+          </w:p>
+        </w:tc>
+        <w:tc>
+          <w:tcPr>
+            <w:tcW w:type="dxa" w:w="4968"/>
+            <w:shd w:fill="F8FAFC"/>
+          </w:tcPr>
+          <w:p>
+            <w:r>
+              <w:rPr>
+                <w:sz w:val="18"/>
+              </w:rPr>
+              <w:t>Prof. Kanagaraj K</w:t>
             </w:r>
           </w:p>
         </w:tc>

</xml_diff>